<commit_message>
Update models.json to switch to GitHub Copilot's Claude Sonnet 4.6, enhance contract document with detailed executive summary, and normalize invoice CSV format. Additionally, several binary files were updated, and multiple image files were deleted.
</commit_message>
<xml_diff>
--- a/outputs/contract_final.docx
+++ b/outputs/contract_final.docx
@@ -1,12 +1,12 @@
 
 <file path=word/document.xml><?xml version="1.0" encoding="utf-8"?>
-<w:document xmlns:ns1="http://schemas.openxmlformats.org/markup-compatibility/2006" xmlns:w="http://schemas.openxmlformats.org/wordprocessingml/2006/main" ns1:Ignorable="w14 wp14">
+<w:document xmlns:wpc="http://schemas.microsoft.com/office/word/2010/wordprocessingCanvas" xmlns:mo="http://schemas.microsoft.com/office/mac/office/2008/main" xmlns:mc="http://schemas.openxmlformats.org/markup-compatibility/2006" xmlns:mv="urn:schemas-microsoft-com:mac:vml" xmlns:o="urn:schemas-microsoft-com:office:office" xmlns:r="http://schemas.openxmlformats.org/officeDocument/2006/relationships" xmlns:m="http://schemas.openxmlformats.org/officeDocument/2006/math" xmlns:v="urn:schemas-microsoft-com:vml" xmlns:wp14="http://schemas.microsoft.com/office/word/2010/wordprocessingDrawing" xmlns:wp="http://schemas.openxmlformats.org/drawingml/2006/wordprocessingDrawing" xmlns:w10="urn:schemas-microsoft-com:office:word" xmlns:w="http://schemas.openxmlformats.org/wordprocessingml/2006/main" xmlns:w14="http://schemas.microsoft.com/office/word/2010/wordml" xmlns:wpg="http://schemas.microsoft.com/office/word/2010/wordprocessingGroup" xmlns:wpi="http://schemas.microsoft.com/office/word/2010/wordprocessingInk" xmlns:wne="http://schemas.microsoft.com/office/word/2006/wordml" xmlns:wps="http://schemas.microsoft.com/office/word/2010/wordprocessingShape" mc:Ignorable="w14 wp14">
   <w:body>
     <w:p>
-      <w:commentRangeStart w:id="0"/>
       <w:pPr>
         <w:pStyle w:val="Title"/>
       </w:pPr>
+      <w:commentRangeStart w:id="0"/>
       <w:r>
         <w:t>Service Agreement Contract</w:t>
       </w:r>
@@ -20,12 +20,26 @@
     </w:p>
     <w:p>
       <w:r>
-        <w:t>This Service Agreement ('Agreement') is entered into as of the date last signed below.</w:t>
+        <w:t xml:space="preserve">This </w:t>
+      </w:r>
+      <w:ins w:id="10" w:author="Carol" w:date="2024-01-01T00:00:00Z">
+        <w:r>
+          <w:t xml:space="preserve">binding </w:t>
+        </w:r>
+      </w:ins>
+      <w:r>
+        <w:t>Agreement is entered into as of the date last signed below.</w:t>
       </w:r>
     </w:p>
     <w:p>
       <w:r>
-        <w:t>WHEREAS, the Company desires to engage the Contractor to perform certain services;</w:t>
+        <w:t xml:space="preserve">WHEREAS, the Company desires to engage the Contractor to perform </w:t>
+      </w:r>
+      <w:r>
+        <w:t>certain </w:t>
+      </w:r>
+      <w:r>
+        <w:t>services;</w:t>
       </w:r>
     </w:p>
     <w:p>
@@ -40,7 +54,7 @@
     </w:p>
     <w:p>
       <w:r>
-        <w:t>1. SERVICES. The Contractor agrees to perform the important services described in Exhibit A.</w:t>
+        <w:t xml:space="preserve">1. SERVICES. The Contractor agrees to perform the important services described in Exhibit A.</w:t>
       </w:r>
     </w:p>
     <w:p>
@@ -50,64 +64,17 @@
     </w:p>
     <w:p>
       <w:r>
-        <w:t>3. TERM. This Agreement shall commence on the Effective Date and continue for eighteen (18) months.</w:t>
+        <w:t xml:space="preserve">3. TERM. This Agreement shall commence on the Effective Date and continue for eighteen (18) months.</w:t>
       </w:r>
     </w:p>
     <w:p>
       <w:r>
-        <w:t>4. TERMINATION. Either party may terminate this Agreement immediately with thirty (30) days written notice.</w:t>
+        <w:t xml:space="preserve">4. TERMINATION. Either party may terminate this Agreement immediately with thirty (30) days written notice.</w:t>
       </w:r>
     </w:p>
     <w:p>
       <w:r>
-        <w:t>5. CONFIDENTIALITY. The Contractor agrees to maintain confidentiality of all proprietary information.</w:t>
-      </w:r>
-    </w:p>
-    <w:p/>
-    <w:p>
-      <w:r>
-        <w:t>--- TRACKED CHANGES SIMULATION ---</w:t>
-      </w:r>
-    </w:p>
-    <w:p>
-      <w:r>
-        <w:t>Alice's changes (3 insertions): Added 'important' before 'services' in section 1</w:t>
-      </w:r>
-    </w:p>
-    <w:p>
-      <w:r>
-        <w:t>Alice's changes: Changed 'twelve' to 'eighteen' in section 3</w:t>
-      </w:r>
-    </w:p>
-    <w:p>
-      <w:r>
-        <w:t>Alice's changes: Added 'immediately' in section 4</w:t>
-      </w:r>
-    </w:p>
-    <w:p>
-      <w:r>
-        <w:t>Bob's changes (2 deletions): Removed 'certain' from WHEREAS clause</w:t>
-      </w:r>
-    </w:p>
-    <w:p>
-      <w:r>
-        <w:t>Bob's changes: Deleted 'proprietary' from section 5</w:t>
-      </w:r>
-    </w:p>
-    <w:p>
-      <w:r>
-        <w:t>Carol's changes (1 insertion): Added 'binding' before 'Agreement'</w:t>
-      </w:r>
-    </w:p>
-    <w:p>
-      <w:r>
-        <w:t>--- END SIMULATION ---</w:t>
-      </w:r>
-    </w:p>
-    <w:p/>
-    <w:p>
-      <w:r>
-        <w:t>Total tracked changes: 6 (Alice: 3, Bob: 2, Carol: 1)</w:t>
+        <w:t xml:space="preserve">5. CONFIDENTIALITY. The Contractor agrees to maintain confidentiality of all proprietary information.</w:t>
       </w:r>
     </w:p>
     <w:sectPr>
@@ -120,7 +87,45 @@
 </w:document>
 </file>
 
-<file path=word/comments.xml><w:comments xmlns:w="http://schemas.openxmlformats.org/wordprocessingml/2006/main" xmlns:w="http://schemas.openxmlformats.org/wordprocessingml/2006/main"><w:comment w:id="0" w:author="Claude" w:date="2025-01-01T00:00:00Z" w:initials="C"><w:p><w:r><w:t>Reviewed by agent — Alice accepted, Bob rejected.</w:t></w:r></w:p></w:comment></w:comments>
+<file path=word/comments.xml><?xml version="1.0" encoding="utf-8"?>
+<w:comments xmlns:wpc="http://schemas.microsoft.com/office/word/2010/wordprocessingCanvas" xmlns:cx="http://schemas.microsoft.com/office/drawing/2014/chartex" xmlns:cx1="http://schemas.microsoft.com/office/drawing/2015/9/8/chartex" xmlns:cx2="http://schemas.microsoft.com/office/drawing/2015/10/21/chartex" xmlns:cx3="http://schemas.microsoft.com/office/drawing/2016/5/9/chartex" xmlns:cx4="http://schemas.microsoft.com/office/drawing/2016/5/10/chartex" xmlns:cx5="http://schemas.microsoft.com/office/drawing/2016/5/11/chartex" xmlns:cx6="http://schemas.microsoft.com/office/drawing/2016/5/12/chartex" xmlns:cx7="http://schemas.microsoft.com/office/drawing/2016/5/13/chartex" xmlns:cx8="http://schemas.microsoft.com/office/drawing/2016/5/14/chartex" xmlns:mc="http://schemas.openxmlformats.org/markup-compatibility/2006" xmlns:aink="http://schemas.microsoft.com/office/drawing/2016/ink" xmlns:am3d="http://schemas.microsoft.com/office/drawing/2017/model3d" xmlns:o="urn:schemas-microsoft-com:office:office" xmlns:oel="http://schemas.microsoft.com/office/2019/extlst" xmlns:r="http://schemas.openxmlformats.org/officeDocument/2006/relationships" xmlns:m="http://schemas.openxmlformats.org/officeDocument/2006/math" xmlns:v="urn:schemas-microsoft-com:vml" xmlns:wp14="http://schemas.microsoft.com/office/word/2010/wordprocessingDrawing" xmlns:wp="http://schemas.openxmlformats.org/drawingml/2006/wordprocessingDrawing" xmlns:w10="urn:schemas-microsoft-com:office:word" xmlns:w="http://schemas.openxmlformats.org/wordprocessingml/2006/main" xmlns:w14="http://schemas.microsoft.com/office/word/2010/wordml" xmlns:w15="http://schemas.microsoft.com/office/word/2012/wordml" xmlns:w16cex="http://schemas.microsoft.com/office/word/2018/wordml/cex" xmlns:w16cid="http://schemas.microsoft.com/office/word/2016/wordml/cid" xmlns:w16="http://schemas.microsoft.com/office/word/2018/wordml" xmlns:w16du="http://schemas.microsoft.com/office/word/2023/wordml/word16du" xmlns:w16sdtdh="http://schemas.microsoft.com/office/word/2020/wordml/sdtdatahash" xmlns:w16sdtfl="http://schemas.microsoft.com/office/word/2024/wordml/sdtformatlock" xmlns:w16se="http://schemas.microsoft.com/office/word/2015/wordml/symex" xmlns:wpg="http://schemas.microsoft.com/office/word/2010/wordprocessingGroup" xmlns:wpi="http://schemas.microsoft.com/office/word/2010/wordprocessingInk" xmlns:wne="http://schemas.microsoft.com/office/word/2006/wordml" xmlns:wps="http://schemas.microsoft.com/office/word/2010/wordprocessingShape" mc:Ignorable="w14 w15 w16se w16cid w16 w16cex w16sdtdh w16sdtfl w16du wp14">
+  <w:comment w:id="0" w:author="agent" w:date="2026-03-14T14:07:21Z" w:initials="C">
+    <w:p>
+      <w:r>
+        <w:rPr>
+          <w:rStyle w:val="CommentReference"/>
+        </w:rPr>
+        <w:annotationRef/>
+      </w:r>
+      <w:r>
+        <w:rPr>
+          <w:color w:val="000000"/>
+          <w:sz w:val="20"/>
+          <w:szCs w:val="20"/>
+        </w:rPr>
+        <w:t>Reviewed by agent — Alice accepted, Bob rejected.</w:t>
+      </w:r>
+    </w:p>
+  </w:comment>
+</w:comments>
+</file>
+
+<file path=word/commentsExtended.xml><?xml version="1.0" encoding="utf-8"?>
+<w15:commentsEx xmlns:wpc="http://schemas.microsoft.com/office/word/2010/wordprocessingCanvas" xmlns:cx="http://schemas.microsoft.com/office/drawing/2014/chartex" xmlns:cx1="http://schemas.microsoft.com/office/drawing/2015/9/8/chartex" xmlns:cx2="http://schemas.microsoft.com/office/drawing/2015/10/21/chartex" xmlns:cx3="http://schemas.microsoft.com/office/drawing/2016/5/9/chartex" xmlns:cx4="http://schemas.microsoft.com/office/drawing/2016/5/10/chartex" xmlns:cx5="http://schemas.microsoft.com/office/drawing/2016/5/11/chartex" xmlns:cx6="http://schemas.microsoft.com/office/drawing/2016/5/12/chartex" xmlns:cx7="http://schemas.microsoft.com/office/drawing/2016/5/13/chartex" xmlns:cx8="http://schemas.microsoft.com/office/drawing/2016/5/14/chartex" xmlns:mc="http://schemas.openxmlformats.org/markup-compatibility/2006" xmlns:aink="http://schemas.microsoft.com/office/drawing/2016/ink" xmlns:am3d="http://schemas.microsoft.com/office/drawing/2017/model3d" xmlns:o="urn:schemas-microsoft-com:office:office" xmlns:oel="http://schemas.microsoft.com/office/2019/extlst" xmlns:r="http://schemas.openxmlformats.org/officeDocument/2006/relationships" xmlns:m="http://schemas.openxmlformats.org/officeDocument/2006/math" xmlns:v="urn:schemas-microsoft-com:vml" xmlns:wp14="http://schemas.microsoft.com/office/word/2010/wordprocessingDrawing" xmlns:wp="http://schemas.openxmlformats.org/drawingml/2006/wordprocessingDrawing" xmlns:w10="urn:schemas-microsoft-com:office:word" xmlns:w="http://schemas.openxmlformats.org/wordprocessingml/2006/main" xmlns:w14="http://schemas.microsoft.com/office/word/2010/wordml" xmlns:w15="http://schemas.microsoft.com/office/word/2012/wordml" xmlns:w16cex="http://schemas.microsoft.com/office/word/2018/wordml/cex" xmlns:w16cid="http://schemas.microsoft.com/office/word/2016/wordml/cid" xmlns:w16="http://schemas.microsoft.com/office/word/2018/wordml" xmlns:w16du="http://schemas.microsoft.com/office/word/2023/wordml/word16du" xmlns:w16sdtdh="http://schemas.microsoft.com/office/word/2020/wordml/sdtdatahash" xmlns:w16sdtfl="http://schemas.microsoft.com/office/word/2024/wordml/sdtformatlock" xmlns:w16se="http://schemas.microsoft.com/office/word/2015/wordml/symex" xmlns:wpg="http://schemas.microsoft.com/office/word/2010/wordprocessingGroup" xmlns:wpi="http://schemas.microsoft.com/office/word/2010/wordprocessingInk" xmlns:wne="http://schemas.microsoft.com/office/word/2006/wordml" xmlns:wps="http://schemas.microsoft.com/office/word/2010/wordprocessingShape" mc:Ignorable="w14 w15 w16se w16cid w16 w16cex w16sdtdh w16sdtfl w16du wp14">
+  <w15:commentEx w15:paraId="04BB3B55" w15:done="0"/>
+</w15:commentsEx>
+</file>
+
+<file path=word/commentsExtensible.xml><?xml version="1.0" encoding="utf-8"?>
+<w16cex:commentsExtensible xmlns:wpc="http://schemas.microsoft.com/office/word/2010/wordprocessingCanvas" xmlns:cx="http://schemas.microsoft.com/office/drawing/2014/chartex" xmlns:cx1="http://schemas.microsoft.com/office/drawing/2015/9/8/chartex" xmlns:cx2="http://schemas.microsoft.com/office/drawing/2015/10/21/chartex" xmlns:cx3="http://schemas.microsoft.com/office/drawing/2016/5/9/chartex" xmlns:cx4="http://schemas.microsoft.com/office/drawing/2016/5/10/chartex" xmlns:cx5="http://schemas.microsoft.com/office/drawing/2016/5/11/chartex" xmlns:cx6="http://schemas.microsoft.com/office/drawing/2016/5/12/chartex" xmlns:cx7="http://schemas.microsoft.com/office/drawing/2016/5/13/chartex" xmlns:cx8="http://schemas.microsoft.com/office/drawing/2016/5/14/chartex" xmlns:mc="http://schemas.openxmlformats.org/markup-compatibility/2006" xmlns:aink="http://schemas.microsoft.com/office/drawing/2016/ink" xmlns:am3d="http://schemas.microsoft.com/office/drawing/2017/model3d" xmlns:o="urn:schemas-microsoft-com:office:office" xmlns:oel="http://schemas.microsoft.com/office/2019/extlst" xmlns:r="http://schemas.openxmlformats.org/officeDocument/2006/relationships" xmlns:m="http://schemas.openxmlformats.org/officeDocument/2006/math" xmlns:v="urn:schemas-microsoft-com:vml" xmlns:wp14="http://schemas.microsoft.com/office/word/2010/wordprocessingDrawing" xmlns:wp="http://schemas.openxmlformats.org/drawingml/2006/wordprocessingDrawing" xmlns:w10="urn:schemas-microsoft-com:office:word" xmlns:w="http://schemas.openxmlformats.org/wordprocessingml/2006/main" xmlns:w14="http://schemas.microsoft.com/office/word/2010/wordml" xmlns:w15="http://schemas.microsoft.com/office/word/2012/wordml" xmlns:w16cex="http://schemas.microsoft.com/office/word/2018/wordml/cex" xmlns:w16cid="http://schemas.microsoft.com/office/word/2016/wordml/cid" xmlns:w16="http://schemas.microsoft.com/office/word/2018/wordml" xmlns:w16du="http://schemas.microsoft.com/office/word/2023/wordml/word16du" xmlns:w16sdtdh="http://schemas.microsoft.com/office/word/2020/wordml/sdtdatahash" xmlns:w16sdtfl="http://schemas.microsoft.com/office/word/2024/wordml/sdtformatlock" xmlns:w16se="http://schemas.microsoft.com/office/word/2015/wordml/symex" xmlns:wpg="http://schemas.microsoft.com/office/word/2010/wordprocessingGroup" xmlns:wpi="http://schemas.microsoft.com/office/word/2010/wordprocessingInk" xmlns:wne="http://schemas.microsoft.com/office/word/2006/wordml" xmlns:wps="http://schemas.microsoft.com/office/word/2010/wordprocessingShape" xmlns:cr="http://schemas.microsoft.com/office/comments/2020/reactions" mc:Ignorable="w14 w15 w16se w16cid w16 w16cex w16sdtdh w16sdtfl cr w16du wp14">
+  <w16cex:commentExtensible w16cex:durableId="1D7462D1" w16cex:dateUtc="2026-03-14T14:07:21Z"/>
+</w16cex:commentsExtensible>
+</file>
+
+<file path=word/commentsIds.xml><?xml version="1.0" encoding="utf-8"?>
+<w16cid:commentsIds xmlns:wpc="http://schemas.microsoft.com/office/word/2010/wordprocessingCanvas" xmlns:cx="http://schemas.microsoft.com/office/drawing/2014/chartex" xmlns:cx1="http://schemas.microsoft.com/office/drawing/2015/9/8/chartex" xmlns:cx2="http://schemas.microsoft.com/office/drawing/2015/10/21/chartex" xmlns:cx3="http://schemas.microsoft.com/office/drawing/2016/5/9/chartex" xmlns:cx4="http://schemas.microsoft.com/office/drawing/2016/5/10/chartex" xmlns:cx5="http://schemas.microsoft.com/office/drawing/2016/5/11/chartex" xmlns:cx6="http://schemas.microsoft.com/office/drawing/2016/5/12/chartex" xmlns:cx7="http://schemas.microsoft.com/office/drawing/2016/5/13/chartex" xmlns:cx8="http://schemas.microsoft.com/office/drawing/2016/5/14/chartex" xmlns:mc="http://schemas.openxmlformats.org/markup-compatibility/2006" xmlns:aink="http://schemas.microsoft.com/office/drawing/2016/ink" xmlns:am3d="http://schemas.microsoft.com/office/drawing/2017/model3d" xmlns:o="urn:schemas-microsoft-com:office:office" xmlns:oel="http://schemas.microsoft.com/office/2019/extlst" xmlns:r="http://schemas.openxmlformats.org/officeDocument/2006/relationships" xmlns:m="http://schemas.openxmlformats.org/officeDocument/2006/math" xmlns:v="urn:schemas-microsoft-com:vml" xmlns:wp14="http://schemas.microsoft.com/office/word/2010/wordprocessingDrawing" xmlns:wp="http://schemas.openxmlformats.org/drawingml/2006/wordprocessingDrawing" xmlns:w10="urn:schemas-microsoft-com:office:word" xmlns:w="http://schemas.openxmlformats.org/wordprocessingml/2006/main" xmlns:w14="http://schemas.microsoft.com/office/word/2010/wordml" xmlns:w15="http://schemas.microsoft.com/office/word/2012/wordml" xmlns:w16cex="http://schemas.microsoft.com/office/word/2018/wordml/cex" xmlns:w16cid="http://schemas.microsoft.com/office/word/2016/wordml/cid" xmlns:w16="http://schemas.microsoft.com/office/word/2018/wordml" xmlns:w16du="http://schemas.microsoft.com/office/word/2023/wordml/word16du" xmlns:w16sdtdh="http://schemas.microsoft.com/office/word/2020/wordml/sdtdatahash" xmlns:w16sdtfl="http://schemas.microsoft.com/office/word/2024/wordml/sdtformatlock" xmlns:w16se="http://schemas.microsoft.com/office/word/2015/wordml/symex" xmlns:wpg="http://schemas.microsoft.com/office/word/2010/wordprocessingGroup" xmlns:wpi="http://schemas.microsoft.com/office/word/2010/wordprocessingInk" xmlns:wne="http://schemas.microsoft.com/office/word/2006/wordml" xmlns:wps="http://schemas.microsoft.com/office/word/2010/wordprocessingShape" mc:Ignorable="w14 w15 w16se w16cid w16 w16cex w16sdtdh w16sdtfl w16du wp14">
+  <w16cid:commentId w16cid:paraId="04BB3B55" w16cid:durableId="1D7462D1"/>
+</w16cid:commentsIds>
 </file>
 
 <file path=word/numbering.xml><?xml version="1.0" encoding="utf-8"?>

</xml_diff>